<commit_message>
Adiciona Projeto Integrador em PDF
</commit_message>
<xml_diff>
--- a/Projeto Integrador Fatec.DOCX
+++ b/Projeto Integrador Fatec.DOCX
@@ -40,7 +40,23 @@
           <w:b/>
           <w:color w:val="FF0000"/>
         </w:rPr>
-        <w:t>ULTIMA MODIFICAÇÂO 08/10/2026</w:t>
+        <w:t xml:space="preserve">ULTIMA MODIFICAÇÂO </w:t>
+      </w:r>
+      <w:r>
+        <w:rPr>
+          <w:b/>
+          <w:color w:val="FF0000"/>
+        </w:rPr>
+        <w:t>27</w:t>
+      </w:r>
+      <w:bookmarkStart w:id="0" w:name="_GoBack"/>
+      <w:bookmarkEnd w:id="0"/>
+      <w:r>
+        <w:rPr>
+          <w:b/>
+          <w:color w:val="FF0000"/>
+        </w:rPr>
+        <w:t>/10/2026</w:t>
       </w:r>
     </w:p>
     <w:p>
@@ -1089,11 +1105,9 @@
       <w:r>
         <w:t xml:space="preserve">Implementar um </w:t>
       </w:r>
-      <w:proofErr w:type="spellStart"/>
-      <w:r>
-        <w:t>prototipo</w:t>
-      </w:r>
-      <w:proofErr w:type="spellEnd"/>
+      <w:r>
+        <w:t>protótipo</w:t>
+      </w:r>
       <w:r>
         <w:t xml:space="preserve"> funcional (MVP);</w:t>
       </w:r>
@@ -2044,7 +2058,13 @@
       </w:pPr>
       <w:r>
         <w:lastRenderedPageBreak/>
-        <w:t>4. ESPECIFICAÇÃO DO SOFTWARE, JOGO OU APLICATIVO</w:t>
+        <w:t>0</w:t>
+      </w:r>
+      <w:r>
+        <w:tab/>
+      </w:r>
+      <w:r>
+        <w:t>. ESPECIFICAÇÃO DO SOFTWARE, JOGO OU APLICATIVO</w:t>
       </w:r>
     </w:p>
     <w:p>
@@ -2207,11 +2227,6 @@
     <w:p>
       <w:pPr>
         <w:pStyle w:val="PargrafodaLista"/>
-        <w:numPr>
-          <w:ilvl w:val="0"/>
-          <w:numId w:val="2"/>
-        </w:numPr>
-        <w:spacing w:after="80"/>
       </w:pPr>
       <w:r>
         <w:t>Parecer jurídico definitivo, declaração automática de nulidade, garantia de detecção de toda cláusula abusiva, representação judicial, negociação com bancos, assinatura eletrônica e envio automático de reclamações.</w:t>
@@ -6703,31 +6718,7 @@
               <w:rPr>
                 <w:color w:val="00B0F0"/>
               </w:rPr>
-              <w:t xml:space="preserve">5.1 - </w:t>
-            </w:r>
-            <w:r>
-              <w:rPr>
-                <w:color w:val="00B0F0"/>
-              </w:rPr>
-              <w:t>Escopo do Projeto</w:t>
-            </w:r>
-            <w:r>
-              <w:rPr>
-                <w:color w:val="00B0F0"/>
-              </w:rPr>
-              <w:t xml:space="preserve"> | </w:t>
-            </w:r>
-            <w:r>
-              <w:rPr>
-                <w:color w:val="00B0F0"/>
-              </w:rPr>
-              <w:t>Visão Geral</w:t>
-            </w:r>
-            <w:r>
-              <w:rPr>
-                <w:color w:val="00B0F0"/>
-              </w:rPr>
-              <w:t>...</w:t>
+              <w:t>5.1 - Escopo do Projeto | Visão Geral...</w:t>
             </w:r>
           </w:p>
           <w:p>
@@ -6986,8 +6977,6 @@
               <w:spacing w:after="200" w:line="360" w:lineRule="auto"/>
               <w:jc w:val="both"/>
             </w:pPr>
-            <w:bookmarkStart w:id="0" w:name="_GoBack"/>
-            <w:bookmarkEnd w:id="0"/>
           </w:p>
         </w:tc>
       </w:tr>
@@ -8237,7 +8226,7 @@
 </file>
 
 <file path=customXml/itemProps1.xml><?xml version="1.0" encoding="utf-8"?>
-<ds:datastoreItem xmlns:ds="http://schemas.openxmlformats.org/officeDocument/2006/customXml" ds:itemID="{7C66BCA8-5CF4-4057-9B36-10E27BE76F0A}">
+<ds:datastoreItem xmlns:ds="http://schemas.openxmlformats.org/officeDocument/2006/customXml" ds:itemID="{D8EEEDEC-813F-4FD7-B53C-E37C96CF52B1}">
   <ds:schemaRefs>
     <ds:schemaRef ds:uri="http://schemas.openxmlformats.org/officeDocument/2006/bibliography"/>
   </ds:schemaRefs>

</xml_diff>